<commit_message>
Thu Feb 26 17:10:17 CST 2026
</commit_message>
<xml_diff>
--- a/send_Hr/简历原文件.docx
+++ b/send_Hr/简历原文件.docx
@@ -124,7 +124,7 @@
           </mc:Choice>
           <mc:Fallback>
             <w:pict>
-              <v:shape w14:anchorId="636E25ED" id="流程图: 手动输入 2" o:spid="_x0000_s1026" style="position:absolute;margin-left:-61.95pt;margin-top:-35.15pt;width:607.05pt;height:202.05pt;rotation:180;flip:x;z-index:-251590656;visibility:visible;mso-wrap-style:square;mso-width-percent:0;mso-height-percent:0;mso-wrap-distance-left:9pt;mso-wrap-distance-top:0;mso-wrap-distance-right:9pt;mso-wrap-distance-bottom:0;mso-position-horizontal:absolute;mso-position-horizontal-relative:text;mso-position-vertical:absolute;mso-position-vertical-relative:text;mso-width-percent:0;mso-height-percent:0;mso-width-relative:margin;mso-height-relative:margin;v-text-anchor:middle" coordsize="10000,10000" o:gfxdata="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" path="m,3036l10000,r,10000l,10000,,3036xe" fillcolor="#5290bf" strokecolor="#5290bf" strokeweight="1pt">
+              <v:shape w14:anchorId="2BD92AA3" id="流程图: 手动输入 2" o:spid="_x0000_s1026" style="position:absolute;margin-left:-61.95pt;margin-top:-35.15pt;width:607.05pt;height:202.05pt;rotation:180;flip:x;z-index:-251590656;visibility:visible;mso-wrap-style:square;mso-width-percent:0;mso-height-percent:0;mso-wrap-distance-left:9pt;mso-wrap-distance-top:0;mso-wrap-distance-right:9pt;mso-wrap-distance-bottom:0;mso-position-horizontal:absolute;mso-position-horizontal-relative:text;mso-position-vertical:absolute;mso-position-vertical-relative:text;mso-width-percent:0;mso-height-percent:0;mso-width-relative:margin;mso-height-relative:margin;v-text-anchor:middle" coordsize="10000,10000" o:gfxdata="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" path="m,3036l10000,r,10000l,10000,,3036xe" fillcolor="#5290bf" strokecolor="#5290bf" strokeweight="1pt">
                 <v:stroke joinstyle="miter"/>
                 <v:path arrowok="t" o:connecttype="custom" o:connectlocs="0,779048;7709535,0;7709535,2566035;0,2566035;0,779048" o:connectangles="0,0,0,0,0"/>
               </v:shape>
@@ -7249,31 +7249,53 @@
         <w:ind w:firstLineChars="0"/>
         <w:jc w:val="left"/>
         <w:rPr>
+          <w:rFonts w:ascii="微软雅黑" w:eastAsia="微软雅黑" w:hAnsi="微软雅黑"/>
+          <w:color w:val="595959" w:themeColor="text1" w:themeTint="A6"/>
+          <w:sz w:val="22"/>
+        </w:rPr>
+      </w:pPr>
+      <w:r>
+        <w:rPr>
           <w:rFonts w:ascii="微软雅黑" w:eastAsia="微软雅黑" w:hAnsi="微软雅黑" w:hint="eastAsia"/>
           <w:color w:val="595959" w:themeColor="text1" w:themeTint="A6"/>
           <w:sz w:val="22"/>
         </w:rPr>
-      </w:pPr>
-      <w:r>
+        <w:t>低功耗设备的测试与优化</w:t>
+      </w:r>
+    </w:p>
+    <w:p>
+      <w:pPr>
+        <w:pStyle w:val="aa"/>
+        <w:numPr>
+          <w:ilvl w:val="0"/>
+          <w:numId w:val="8"/>
+        </w:numPr>
+        <w:snapToGrid w:val="0"/>
+        <w:spacing w:line="360" w:lineRule="exact"/>
+        <w:ind w:firstLineChars="0"/>
+        <w:jc w:val="left"/>
         <w:rPr>
           <w:rFonts w:ascii="微软雅黑" w:eastAsia="微软雅黑" w:hAnsi="微软雅黑" w:hint="eastAsia"/>
           <w:color w:val="595959" w:themeColor="text1" w:themeTint="A6"/>
           <w:sz w:val="22"/>
         </w:rPr>
-        <w:t>低功耗设备的测试与优化</w:t>
-      </w:r>
-    </w:p>
-    <w:p>
-      <w:pPr>
-        <w:snapToGrid w:val="0"/>
-        <w:spacing w:line="360" w:lineRule="exact"/>
-        <w:jc w:val="left"/>
+      </w:pPr>
+      <w:r>
         <w:rPr>
           <w:rFonts w:ascii="微软雅黑" w:eastAsia="微软雅黑" w:hAnsi="微软雅黑" w:hint="eastAsia"/>
           <w:color w:val="595959" w:themeColor="text1" w:themeTint="A6"/>
           <w:sz w:val="22"/>
         </w:rPr>
-      </w:pPr>
+        <w:t>一个</w:t>
+      </w:r>
+      <w:r>
+        <w:rPr>
+          <w:rFonts w:ascii="微软雅黑" w:eastAsia="微软雅黑" w:hAnsi="微软雅黑" w:hint="eastAsia"/>
+          <w:color w:val="595959" w:themeColor="text1" w:themeTint="A6"/>
+          <w:sz w:val="22"/>
+        </w:rPr>
+        <w:t>通过调用</w:t>
+      </w:r>
     </w:p>
     <w:p>
       <w:pPr>

</xml_diff>